<commit_message>
Replace W05 figure transcripts with actual screenshots and datasheet excerpts
</commit_message>
<xml_diff>
--- a/w05/Embedded System - Homework Week 5 - NQ6141054 - Completed.docx
+++ b/w05/Embedded System - Homework Week 5 - NQ6141054 - Completed.docx
@@ -585,7 +585,7 @@
           </w:tcPr>
           <w:p>
             <w:pPr>
-              <w:keepNext/>
+              <w:keepNext w:val="1"/>
               <w:spacing w:before="40" w:after="40"/>
             </w:pPr>
             <w:r>
@@ -595,55 +595,65 @@
         </w:tc>
       </w:tr>
       <w:tr>
-        <w:trPr>
-          <w:cantSplit/>
-          <w:trHeight w:val="2520"/>
-        </w:trPr>
+        <w:trPr/>
         <w:tc>
           <w:tcPr>
             <w:tcW w:w="9360" w:type="dxa"/>
             <w:vAlign w:val="center"/>
           </w:tcPr>
           <w:p>
-            <w:pPr>
-              <w:spacing w:before="0" w:after="80"/>
-              <w:jc w:val="left"/>
-              <w:keepNext w:val="0"/>
-            </w:pPr>
-            <w:r>
-              <w:rPr>
-                <w:rFonts w:hAnsi="Consolas" w:ascii="Consolas" w:eastAsia="Microsoft JhengHei"/>
+            <w:pPr xmlns:w="http://schemas.openxmlformats.org/wordprocessingml/2006/main">
+              <w:keepNext w:val="1"/>
+              <w:jc w:val="center"/>
+              <w:spacing w:before="80" w:after="40"/>
+            </w:pPr>
+            <w:r xmlns:w="http://schemas.openxmlformats.org/wordprocessingml/2006/main">
+              <w:drawing>
+                <wp:inline xmlns:wp="http://schemas.openxmlformats.org/drawingml/2006/wordprocessingDrawing" distT="0" distB="0" distL="0" distR="0">
+                  <wp:extent cx="5029200" cy="2686405"/>
+                  <wp:docPr id="2001" name="Actual W05 source figure 2001" descr="Original application screenshot or labelled original PDF excerpt"/>
+                  <a:graphic xmlns:a="http://schemas.openxmlformats.org/drawingml/2006/main">
+                    <a:graphicData uri="http://schemas.openxmlformats.org/drawingml/2006/picture">
+                      <pic:pic xmlns:pic="http://schemas.openxmlformats.org/drawingml/2006/picture">
+                        <pic:nvPicPr>
+                          <pic:cNvPr id="0" name="W05 figure 2001"/>
+                          <pic:cNvPicPr/>
+                        </pic:nvPicPr>
+                        <pic:blipFill>
+                          <a:blip xmlns:r="http://schemas.openxmlformats.org/officeDocument/2006/relationships" r:embed="rIdW05FigureScreenshot1"/>
+                          <a:stretch>
+                            <a:fillRect/>
+                          </a:stretch>
+                        </pic:blipFill>
+                        <pic:spPr>
+                          <a:xfrm>
+                            <a:off x="0" y="0"/>
+                            <a:ext cx="5029200" cy="2686405"/>
+                          </a:xfrm>
+                          <a:prstGeom prst="rect">
+                            <a:avLst/>
+                          </a:prstGeom>
+                        </pic:spPr>
+                      </pic:pic>
+                    </a:graphicData>
+                  </a:graphic>
+                </wp:inline>
+              </w:drawing>
+            </w:r>
+          </w:p>
+          <w:p>
+            <w:pPr xmlns:w="http://schemas.openxmlformats.org/wordprocessingml/2006/main">
+              <w:keepNext w:val="0"/>
+              <w:spacing w:before="40" w:after="100"/>
+              <w:jc w:val="left"/>
+            </w:pPr>
+            <w:r>
+              <w:rPr xmlns:w="http://schemas.openxmlformats.org/wordprocessingml/2006/main">
+                <w:rFonts w:ascii="Calibri" w:hAnsi="Calibri"/>
                 <w:sz w:val="18"/>
                 <w:color w:val="000000"/>
               </w:rPr>
-              <w:t xml:space="preserve">Saved serial output — w05/scan.txt (capture dated 2026-10-08)</w:t>
-            </w:r>
-            <w:r>
-              <w:rPr>
-                <w:rFonts w:hAnsi="Consolas" w:ascii="Consolas" w:eastAsia="Microsoft JhengHei"/>
-                <w:sz w:val="18"/>
-                <w:color w:val="000000"/>
-              </w:rPr>
-              <w:br/>
-              <w:t xml:space="preserve">addr,ack</w:t>
-            </w:r>
-            <w:r>
-              <w:rPr>
-                <w:rFonts w:hAnsi="Consolas" w:ascii="Consolas" w:eastAsia="Microsoft JhengHei"/>
-                <w:sz w:val="18"/>
-                <w:color w:val="000000"/>
-              </w:rPr>
-              <w:br/>
-              <w:t xml:space="preserve">0x68,yes</w:t>
-            </w:r>
-            <w:r>
-              <w:rPr>
-                <w:rFonts w:hAnsi="Consolas" w:ascii="Consolas" w:eastAsia="Microsoft JhengHei"/>
-                <w:sz w:val="18"/>
-                <w:color w:val="000000"/>
-              </w:rPr>
-              <w:br/>
-              <w:t xml:space="preserve">devices_answering=1</w:t>
+              <w:t>Figure 1. Original w05/scan.txt reopened in Notepad on 2026-10-19: one device answers at 0x68. Screenshot cropped to log content.</w:t>
             </w:r>
           </w:p>
         </w:tc>
@@ -1831,7 +1841,7 @@
           </w:tcPr>
           <w:p>
             <w:pPr>
-              <w:keepNext/>
+              <w:keepNext w:val="1"/>
               <w:spacing w:before="40" w:after="40"/>
             </w:pPr>
             <w:r>
@@ -1841,100 +1851,65 @@
         </w:tc>
       </w:tr>
       <w:tr>
-        <w:trPr>
-          <w:cantSplit/>
-          <w:trHeight w:val="2520"/>
-        </w:trPr>
+        <w:trPr/>
         <w:tc>
           <w:tcPr>
             <w:tcW w:w="9360" w:type="dxa"/>
             <w:vAlign w:val="center"/>
           </w:tcPr>
           <w:p>
-            <w:pPr>
-              <w:spacing w:before="0" w:after="80"/>
-              <w:jc w:val="left"/>
-              <w:keepNext w:val="0"/>
-            </w:pPr>
-            <w:r>
-              <w:rPr>
-                <w:rFonts w:hAnsi="Consolas" w:ascii="Consolas" w:eastAsia="Microsoft JhengHei"/>
-                <w:sz w:val="16"/>
-                <w:color w:val="000000"/>
-              </w:rPr>
-              <w:t xml:space="preserve">bus_table.py output from w05/buses.txt</w:t>
-            </w:r>
-            <w:r>
-              <w:rPr>
-                <w:rFonts w:hAnsi="Consolas" w:ascii="Consolas" w:eastAsia="Microsoft JhengHei"/>
-                <w:sz w:val="16"/>
-                <w:color w:val="000000"/>
-              </w:rPr>
-              <w:br/>
-              <w:t xml:space="preserve">bus    setting          pins       kB/s     kbit/s  kbit/s/pin     us/6B    payload</w:t>
-            </w:r>
-            <w:r>
-              <w:rPr>
-                <w:rFonts w:hAnsi="Consolas" w:ascii="Consolas" w:eastAsia="Microsoft JhengHei"/>
-                <w:sz w:val="16"/>
-                <w:color w:val="000000"/>
-              </w:rPr>
-              <w:br/>
-              <w:t xml:space="preserve">i2c    100kHz              2        6.6       52.6        26.3     911.8  not check</w:t>
-            </w:r>
-            <w:r>
-              <w:rPr>
-                <w:rFonts w:hAnsi="Consolas" w:ascii="Consolas" w:eastAsia="Microsoft JhengHei"/>
-                <w:sz w:val="16"/>
-                <w:color w:val="000000"/>
-              </w:rPr>
-              <w:br/>
-              <w:t xml:space="preserve">i2c    400kHz              2       22.4      179.5        89.8     267.3  not check</w:t>
-            </w:r>
-            <w:r>
-              <w:rPr>
-                <w:rFonts w:hAnsi="Consolas" w:ascii="Consolas" w:eastAsia="Microsoft JhengHei"/>
-                <w:sz w:val="16"/>
-                <w:color w:val="000000"/>
-              </w:rPr>
-              <w:br/>
-              <w:t xml:space="preserve">spi    1MHz                4       95.5      763.9       191.0      62.8 12000/12000</w:t>
-            </w:r>
-            <w:r>
-              <w:rPr>
-                <w:rFonts w:hAnsi="Consolas" w:ascii="Consolas" w:eastAsia="Microsoft JhengHei"/>
-                <w:sz w:val="16"/>
-                <w:color w:val="000000"/>
-              </w:rPr>
-              <w:br/>
-              <w:t xml:space="preserve">spi    8MHz                4      402.5     3220.2       805.0      14.9 12000/12000</w:t>
-            </w:r>
-            <w:r>
-              <w:rPr>
-                <w:rFonts w:hAnsi="Consolas" w:ascii="Consolas" w:eastAsia="Microsoft JhengHei"/>
-                <w:sz w:val="16"/>
-                <w:color w:val="000000"/>
-              </w:rPr>
-              <w:br/>
-              <w:t xml:space="preserve">uart   115200-115200       1        8.9       71.5        71.5     671.5  1200/1200</w:t>
-            </w:r>
-            <w:r>
-              <w:rPr>
-                <w:rFonts w:hAnsi="Consolas" w:ascii="Consolas" w:eastAsia="Microsoft JhengHei"/>
-                <w:sz w:val="16"/>
-                <w:color w:val="000000"/>
-              </w:rPr>
-              <w:br/>
-              <w:t xml:space="preserve">uart   115200-125000       1        9.0       71.6        71.6     670.3   320/1200</w:t>
-            </w:r>
-            <w:r>
-              <w:rPr>
-                <w:rFonts w:hAnsi="Consolas" w:ascii="Consolas" w:eastAsia="Microsoft JhengHei"/>
-                <w:sz w:val="16"/>
-                <w:color w:val="000000"/>
-              </w:rPr>
-              <w:br/>
-              <w:t xml:space="preserve">Mismatched UART: elapsed time includes receive time-outs; the rate is of the attempt.</w:t>
+            <w:pPr xmlns:w="http://schemas.openxmlformats.org/wordprocessingml/2006/main">
+              <w:keepNext w:val="1"/>
+              <w:jc w:val="center"/>
+              <w:spacing w:before="80" w:after="40"/>
+            </w:pPr>
+            <w:r xmlns:w="http://schemas.openxmlformats.org/wordprocessingml/2006/main">
+              <w:drawing>
+                <wp:inline xmlns:wp="http://schemas.openxmlformats.org/drawingml/2006/wordprocessingDrawing" distT="0" distB="0" distL="0" distR="0">
+                  <wp:extent cx="5623560" cy="1709121"/>
+                  <wp:docPr id="2002" name="Actual W05 source figure 2002" descr="Original application screenshot or labelled original PDF excerpt"/>
+                  <a:graphic xmlns:a="http://schemas.openxmlformats.org/drawingml/2006/main">
+                    <a:graphicData uri="http://schemas.openxmlformats.org/drawingml/2006/picture">
+                      <pic:pic xmlns:pic="http://schemas.openxmlformats.org/drawingml/2006/picture">
+                        <pic:nvPicPr>
+                          <pic:cNvPr id="0" name="W05 figure 2002"/>
+                          <pic:cNvPicPr/>
+                        </pic:nvPicPr>
+                        <pic:blipFill>
+                          <a:blip xmlns:r="http://schemas.openxmlformats.org/officeDocument/2006/relationships" r:embed="rIdW05FigureScreenshot2"/>
+                          <a:stretch>
+                            <a:fillRect/>
+                          </a:stretch>
+                        </pic:blipFill>
+                        <pic:spPr>
+                          <a:xfrm>
+                            <a:off x="0" y="0"/>
+                            <a:ext cx="5623560" cy="1709121"/>
+                          </a:xfrm>
+                          <a:prstGeom prst="rect">
+                            <a:avLst/>
+                          </a:prstGeom>
+                        </pic:spPr>
+                      </pic:pic>
+                    </a:graphicData>
+                  </a:graphic>
+                </wp:inline>
+              </w:drawing>
+            </w:r>
+          </w:p>
+          <w:p>
+            <w:pPr xmlns:w="http://schemas.openxmlformats.org/wordprocessingml/2006/main">
+              <w:keepNext w:val="0"/>
+              <w:spacing w:before="40" w:after="100"/>
+              <w:jc w:val="left"/>
+            </w:pPr>
+            <w:r>
+              <w:rPr xmlns:w="http://schemas.openxmlformats.org/wordprocessingml/2006/main">
+                <w:rFonts w:ascii="Calibri" w:hAnsi="Calibri"/>
+                <w:sz w:val="18"/>
+                <w:color w:val="000000"/>
+              </w:rPr>
+              <w:t>Figure 2. Actual bus_table.py output from saved w05/buses.txt, reopened in Notepad. All six rows and the UART timeout warning are visible; cropped screenshot.</w:t>
             </w:r>
           </w:p>
         </w:tc>
@@ -2553,7 +2528,7 @@
     </w:p>
     <w:p>
       <w:pPr>
-        <w:keepNext/>
+        <w:keepNext w:val="0"/>
         <w:keepLines/>
       </w:pPr>
       <w:r>
@@ -2587,7 +2562,7 @@
           </w:tcPr>
           <w:p>
             <w:pPr>
-              <w:keepNext/>
+              <w:keepNext w:val="1"/>
               <w:spacing w:before="40" w:after="40"/>
             </w:pPr>
             <w:r>
@@ -2599,7 +2574,6 @@
       <w:tr>
         <w:trPr>
           <w:cantSplit/>
-          <w:trHeight w:val="2160"/>
         </w:trPr>
         <w:tc>
           <w:tcPr>
@@ -2607,68 +2581,390 @@
             <w:vAlign w:val="center"/>
           </w:tcPr>
           <w:p>
-            <w:pPr>
-              <w:spacing w:before="0" w:after="80"/>
-              <w:jc w:val="left"/>
-              <w:keepNext w:val="0"/>
-            </w:pPr>
-            <w:r>
-              <w:rPr>
-                <w:rFonts w:hAnsi="Calibri" w:ascii="Calibri" w:eastAsia="Microsoft JhengHei"/>
-                <w:sz w:val="20"/>
-                <w:color w:val="000000"/>
-              </w:rPr>
-              <w:t xml:space="preserve">Source checked: RM-MPU-6000A-00, Revision 4.2.</w:t>
-            </w:r>
-            <w:r>
-              <w:rPr>
-                <w:rFonts w:hAnsi="Calibri" w:ascii="Calibri" w:eastAsia="Microsoft JhengHei"/>
-                <w:sz w:val="20"/>
-                <w:color w:val="000000"/>
-              </w:rPr>
-              <w:br/>
-              <w:t xml:space="preserve">WHO_AM_I: p. 45, §4.32.</w:t>
-            </w:r>
-            <w:r>
-              <w:rPr>
-                <w:rFonts w:hAnsi="Calibri" w:ascii="Calibri" w:eastAsia="Microsoft JhengHei"/>
-                <w:sz w:val="20"/>
-                <w:color w:val="000000"/>
-              </w:rPr>
-              <w:br/>
-              <w:t xml:space="preserve">ACCEL_CONFIG full-scale field: p. 15, §4.5.</w:t>
-            </w:r>
-            <w:r>
-              <w:rPr>
-                <w:rFonts w:hAnsi="Calibri" w:ascii="Calibri" w:eastAsia="Microsoft JhengHei"/>
-                <w:sz w:val="20"/>
-                <w:color w:val="000000"/>
-              </w:rPr>
-              <w:br/>
-              <w:t xml:space="preserve">GYRO_CONFIG full-scale field: p. 14, §4.4.</w:t>
-            </w:r>
-            <w:r>
-              <w:rPr>
-                <w:rFonts w:hAnsi="Calibri" w:ascii="Calibri" w:eastAsia="Microsoft JhengHei"/>
-                <w:sz w:val="20"/>
-                <w:color w:val="000000"/>
-              </w:rPr>
-              <w:br/>
-              <w:t xml:space="preserve">Accelerometer sensitivity: p. 29, §4.17.</w:t>
-            </w:r>
-            <w:r>
-              <w:rPr>
-                <w:rFonts w:hAnsi="Calibri" w:ascii="Calibri" w:eastAsia="Microsoft JhengHei"/>
-                <w:sz w:val="20"/>
-                <w:color w:val="000000"/>
-              </w:rPr>
-              <w:br/>
-              <w:t xml:space="preserve">Local source: D:/嵌入式/MPU-6000-Register-Map.pdf</w:t>
+            <w:pPr xmlns:w="http://schemas.openxmlformats.org/wordprocessingml/2006/main">
+              <w:keepNext w:val="1"/>
+              <w:jc w:val="center"/>
+              <w:spacing w:before="80" w:after="40"/>
+            </w:pPr>
+            <w:r xmlns:w="http://schemas.openxmlformats.org/wordprocessingml/2006/main">
+              <w:drawing>
+                <wp:inline xmlns:wp="http://schemas.openxmlformats.org/drawingml/2006/wordprocessingDrawing" distT="0" distB="0" distL="0" distR="0">
+                  <wp:extent cx="5623560" cy="2338687"/>
+                  <wp:docPr id="2003" name="Actual W05 source figure 2003" descr="Original application screenshot or labelled original PDF excerpt"/>
+                  <a:graphic xmlns:a="http://schemas.openxmlformats.org/drawingml/2006/main">
+                    <a:graphicData uri="http://schemas.openxmlformats.org/drawingml/2006/picture">
+                      <pic:pic xmlns:pic="http://schemas.openxmlformats.org/drawingml/2006/picture">
+                        <pic:nvPicPr>
+                          <pic:cNvPr id="0" name="W05 figure 2003"/>
+                          <pic:cNvPicPr/>
+                        </pic:nvPicPr>
+                        <pic:blipFill>
+                          <a:blip xmlns:r="http://schemas.openxmlformats.org/officeDocument/2006/relationships" r:embed="rIdW05FigureScreenshot3"/>
+                          <a:stretch>
+                            <a:fillRect/>
+                          </a:stretch>
+                        </pic:blipFill>
+                        <pic:spPr>
+                          <a:xfrm>
+                            <a:off x="0" y="0"/>
+                            <a:ext cx="5623560" cy="2338687"/>
+                          </a:xfrm>
+                          <a:prstGeom prst="rect">
+                            <a:avLst/>
+                          </a:prstGeom>
+                        </pic:spPr>
+                      </pic:pic>
+                    </a:graphicData>
+                  </a:graphic>
+                </wp:inline>
+              </w:drawing>
+            </w:r>
+          </w:p>
+          <w:p>
+            <w:pPr xmlns:w="http://schemas.openxmlformats.org/wordprocessingml/2006/main">
+              <w:keepNext w:val="0"/>
+              <w:spacing w:before="40" w:after="100"/>
+              <w:jc w:val="left"/>
+            </w:pPr>
+            <w:r>
+              <w:rPr xmlns:w="http://schemas.openxmlformats.org/wordprocessingml/2006/main">
+                <w:rFonts w:ascii="Calibri" w:hAnsi="Calibri"/>
+                <w:sz w:val="18"/>
+                <w:color w:val="000000"/>
+              </w:rPr>
+              <w:t>Figure 3a. Original Register Map rev. 4.2, p. 45, section 4.32: WHO_AM_I register 0x75 has default 0x68. PDF page excerpt.</w:t>
             </w:r>
           </w:p>
         </w:tc>
       </w:tr>
     </w:tbl>
+    <w:p>
+      <w:pPr xmlns:w="http://schemas.openxmlformats.org/wordprocessingml/2006/main">
+        <w:keepNext w:val="0"/>
+        <w:spacing w:before="0" w:after="40" w:line="20" w:lineRule="exact"/>
+        <w:rPr>
+          <w:sz w:val="2"/>
+        </w:rPr>
+      </w:pPr>
+    </w:p>
+    <w:tbl>
+      <w:tblPr>
+        <w:tblStyle w:val="TableGrid"/>
+        <w:tblW w:w="0" w:type="auto"/>
+        <w:tblLayout w:type="fixed"/>
+        <w:tblLook w:val="04A0" w:firstRow="1" w:lastRow="0" w:firstColumn="1" w:lastColumn="0" w:noHBand="0" w:noVBand="1"/>
+      </w:tblPr>
+      <w:tblGrid>
+        <w:gridCol w:w="9360"/>
+      </w:tblGrid>
+      <w:tr>
+        <w:trPr>
+          <w:cantSplit/>
+        </w:trPr>
+        <w:tc>
+          <w:tcPr>
+            <w:tcW w:w="9360" w:type="dxa"/>
+            <w:shd w:val="clear" w:color="auto" w:fill="F2F2F2"/>
+          </w:tcPr>
+          <w:p>
+            <w:pPr>
+              <w:keepNext w:val="1"/>
+              <w:spacing w:before="40" w:after="40"/>
+            </w:pPr>
+            <w:r>
+              <w:t>Figures for section 3 (optional)</w:t>
+            </w:r>
+          </w:p>
+        </w:tc>
+      </w:tr>
+      <w:tr>
+        <w:trPr>
+          <w:cantSplit/>
+        </w:trPr>
+        <w:tc>
+          <w:tcPr>
+            <w:tcW w:w="9360" w:type="dxa"/>
+            <w:vAlign w:val="center"/>
+          </w:tcPr>
+          <w:p>
+            <w:pPr xmlns:w="http://schemas.openxmlformats.org/wordprocessingml/2006/main">
+              <w:keepNext w:val="1"/>
+              <w:jc w:val="center"/>
+              <w:spacing w:before="80" w:after="40"/>
+            </w:pPr>
+            <w:r xmlns:w="http://schemas.openxmlformats.org/wordprocessingml/2006/main">
+              <w:drawing>
+                <wp:inline xmlns:wp="http://schemas.openxmlformats.org/drawingml/2006/wordprocessingDrawing" distT="0" distB="0" distL="0" distR="0">
+                  <wp:extent cx="5623560" cy="2321406"/>
+                  <wp:docPr id="2004" name="Actual W05 source figure 2004" descr="Original application screenshot or labelled original PDF excerpt"/>
+                  <a:graphic xmlns:a="http://schemas.openxmlformats.org/drawingml/2006/main">
+                    <a:graphicData uri="http://schemas.openxmlformats.org/drawingml/2006/picture">
+                      <pic:pic xmlns:pic="http://schemas.openxmlformats.org/drawingml/2006/picture">
+                        <pic:nvPicPr>
+                          <pic:cNvPr id="0" name="W05 figure 2004"/>
+                          <pic:cNvPicPr/>
+                        </pic:nvPicPr>
+                        <pic:blipFill>
+                          <a:blip xmlns:r="http://schemas.openxmlformats.org/officeDocument/2006/relationships" r:embed="rIdW05FigureScreenshot4"/>
+                          <a:stretch>
+                            <a:fillRect/>
+                          </a:stretch>
+                        </pic:blipFill>
+                        <pic:spPr>
+                          <a:xfrm>
+                            <a:off x="0" y="0"/>
+                            <a:ext cx="5623560" cy="2321406"/>
+                          </a:xfrm>
+                          <a:prstGeom prst="rect">
+                            <a:avLst/>
+                          </a:prstGeom>
+                        </pic:spPr>
+                      </pic:pic>
+                    </a:graphicData>
+                  </a:graphic>
+                </wp:inline>
+              </w:drawing>
+            </w:r>
+          </w:p>
+          <w:p>
+            <w:pPr xmlns:w="http://schemas.openxmlformats.org/wordprocessingml/2006/main">
+              <w:keepNext w:val="0"/>
+              <w:spacing w:before="40" w:after="100"/>
+              <w:jc w:val="left"/>
+            </w:pPr>
+            <w:r>
+              <w:rPr xmlns:w="http://schemas.openxmlformats.org/wordprocessingml/2006/main">
+                <w:rFonts w:ascii="Calibri" w:hAnsi="Calibri"/>
+                <w:sz w:val="18"/>
+                <w:color w:val="000000"/>
+              </w:rPr>
+              <w:t>Figure 3b. Two excerpts from original p. 14, section 4.4: FS_SEL occupies bits 4:3; FS_SEL=1 selects +/-500 deg/s, giving configuration byte 0x08.</w:t>
+            </w:r>
+          </w:p>
+        </w:tc>
+      </w:tr>
+    </w:tbl>
+    <w:p>
+      <w:pPr xmlns:w="http://schemas.openxmlformats.org/wordprocessingml/2006/main">
+        <w:keepNext w:val="0"/>
+        <w:spacing w:before="0" w:after="40" w:line="20" w:lineRule="exact"/>
+        <w:rPr>
+          <w:sz w:val="2"/>
+        </w:rPr>
+      </w:pPr>
+    </w:p>
+    <w:tbl>
+      <w:tblPr>
+        <w:tblStyle w:val="TableGrid"/>
+        <w:tblW w:w="0" w:type="auto"/>
+        <w:tblLayout w:type="fixed"/>
+        <w:tblLook w:val="04A0" w:firstRow="1" w:lastRow="0" w:firstColumn="1" w:lastColumn="0" w:noHBand="0" w:noVBand="1"/>
+      </w:tblPr>
+      <w:tblGrid>
+        <w:gridCol w:w="9360"/>
+      </w:tblGrid>
+      <w:tr>
+        <w:trPr>
+          <w:cantSplit/>
+        </w:trPr>
+        <w:tc>
+          <w:tcPr>
+            <w:tcW w:w="9360" w:type="dxa"/>
+            <w:shd w:val="clear" w:color="auto" w:fill="F2F2F2"/>
+          </w:tcPr>
+          <w:p>
+            <w:pPr>
+              <w:keepNext w:val="1"/>
+              <w:spacing w:before="40" w:after="40"/>
+            </w:pPr>
+            <w:r>
+              <w:t>Figures for section 3 (optional)</w:t>
+            </w:r>
+          </w:p>
+        </w:tc>
+      </w:tr>
+      <w:tr>
+        <w:trPr>
+          <w:cantSplit/>
+        </w:trPr>
+        <w:tc>
+          <w:tcPr>
+            <w:tcW w:w="9360" w:type="dxa"/>
+            <w:vAlign w:val="center"/>
+          </w:tcPr>
+          <w:p>
+            <w:pPr xmlns:w="http://schemas.openxmlformats.org/wordprocessingml/2006/main">
+              <w:keepNext w:val="1"/>
+              <w:jc w:val="center"/>
+              <w:spacing w:before="80" w:after="40"/>
+            </w:pPr>
+            <w:r xmlns:w="http://schemas.openxmlformats.org/wordprocessingml/2006/main">
+              <w:drawing>
+                <wp:inline xmlns:wp="http://schemas.openxmlformats.org/drawingml/2006/wordprocessingDrawing" distT="0" distB="0" distL="0" distR="0">
+                  <wp:extent cx="5623560" cy="2240426"/>
+                  <wp:docPr id="2005" name="Actual W05 source figure 2005" descr="Original application screenshot or labelled original PDF excerpt"/>
+                  <a:graphic xmlns:a="http://schemas.openxmlformats.org/drawingml/2006/main">
+                    <a:graphicData uri="http://schemas.openxmlformats.org/drawingml/2006/picture">
+                      <pic:pic xmlns:pic="http://schemas.openxmlformats.org/drawingml/2006/picture">
+                        <pic:nvPicPr>
+                          <pic:cNvPr id="0" name="W05 figure 2005"/>
+                          <pic:cNvPicPr/>
+                        </pic:nvPicPr>
+                        <pic:blipFill>
+                          <a:blip xmlns:r="http://schemas.openxmlformats.org/officeDocument/2006/relationships" r:embed="rIdW05FigureScreenshot5"/>
+                          <a:stretch>
+                            <a:fillRect/>
+                          </a:stretch>
+                        </pic:blipFill>
+                        <pic:spPr>
+                          <a:xfrm>
+                            <a:off x="0" y="0"/>
+                            <a:ext cx="5623560" cy="2240426"/>
+                          </a:xfrm>
+                          <a:prstGeom prst="rect">
+                            <a:avLst/>
+                          </a:prstGeom>
+                        </pic:spPr>
+                      </pic:pic>
+                    </a:graphicData>
+                  </a:graphic>
+                </wp:inline>
+              </w:drawing>
+            </w:r>
+          </w:p>
+          <w:p>
+            <w:pPr xmlns:w="http://schemas.openxmlformats.org/wordprocessingml/2006/main">
+              <w:keepNext w:val="0"/>
+              <w:spacing w:before="40" w:after="100"/>
+              <w:jc w:val="left"/>
+            </w:pPr>
+            <w:r>
+              <w:rPr xmlns:w="http://schemas.openxmlformats.org/wordprocessingml/2006/main">
+                <w:rFonts w:ascii="Calibri" w:hAnsi="Calibri"/>
+                <w:sz w:val="18"/>
+                <w:color w:val="000000"/>
+              </w:rPr>
+              <w:t>Figure 3c. Two excerpts from original p. 15, section 4.5: AFS_SEL occupies bits 4:3; AFS_SEL=1 selects +/-4 g, giving configuration byte 0x08.</w:t>
+            </w:r>
+          </w:p>
+        </w:tc>
+      </w:tr>
+    </w:tbl>
+    <w:p>
+      <w:pPr xmlns:w="http://schemas.openxmlformats.org/wordprocessingml/2006/main">
+        <w:keepNext w:val="0"/>
+        <w:spacing w:before="0" w:after="40" w:line="20" w:lineRule="exact"/>
+        <w:rPr>
+          <w:sz w:val="2"/>
+        </w:rPr>
+      </w:pPr>
+    </w:p>
+    <w:tbl>
+      <w:tblPr>
+        <w:tblStyle w:val="TableGrid"/>
+        <w:tblW w:w="0" w:type="auto"/>
+        <w:tblLayout w:type="fixed"/>
+        <w:tblLook w:val="04A0" w:firstRow="1" w:lastRow="0" w:firstColumn="1" w:lastColumn="0" w:noHBand="0" w:noVBand="1"/>
+      </w:tblPr>
+      <w:tblGrid>
+        <w:gridCol w:w="9360"/>
+      </w:tblGrid>
+      <w:tr>
+        <w:trPr>
+          <w:cantSplit/>
+        </w:trPr>
+        <w:tc>
+          <w:tcPr>
+            <w:tcW w:w="9360" w:type="dxa"/>
+            <w:shd w:val="clear" w:color="auto" w:fill="F2F2F2"/>
+          </w:tcPr>
+          <w:p>
+            <w:pPr>
+              <w:keepNext w:val="1"/>
+              <w:spacing w:before="40" w:after="40"/>
+            </w:pPr>
+            <w:r>
+              <w:t>Figures for section 3 (optional)</w:t>
+            </w:r>
+          </w:p>
+        </w:tc>
+      </w:tr>
+      <w:tr>
+        <w:trPr>
+          <w:cantSplit/>
+        </w:trPr>
+        <w:tc>
+          <w:tcPr>
+            <w:tcW w:w="9360" w:type="dxa"/>
+            <w:vAlign w:val="center"/>
+          </w:tcPr>
+          <w:p>
+            <w:pPr xmlns:w="http://schemas.openxmlformats.org/wordprocessingml/2006/main">
+              <w:keepNext w:val="1"/>
+              <w:jc w:val="center"/>
+              <w:spacing w:before="80" w:after="40"/>
+            </w:pPr>
+            <w:r xmlns:w="http://schemas.openxmlformats.org/wordprocessingml/2006/main">
+              <w:drawing>
+                <wp:inline xmlns:wp="http://schemas.openxmlformats.org/drawingml/2006/wordprocessingDrawing" distT="0" distB="0" distL="0" distR="0">
+                  <wp:extent cx="5623560" cy="1403776"/>
+                  <wp:docPr id="2006" name="Actual W05 source figure 2006" descr="Original application screenshot or labelled original PDF excerpt"/>
+                  <a:graphic xmlns:a="http://schemas.openxmlformats.org/drawingml/2006/main">
+                    <a:graphicData uri="http://schemas.openxmlformats.org/drawingml/2006/picture">
+                      <pic:pic xmlns:pic="http://schemas.openxmlformats.org/drawingml/2006/picture">
+                        <pic:nvPicPr>
+                          <pic:cNvPr id="0" name="W05 figure 2006"/>
+                          <pic:cNvPicPr/>
+                        </pic:nvPicPr>
+                        <pic:blipFill>
+                          <a:blip xmlns:r="http://schemas.openxmlformats.org/officeDocument/2006/relationships" r:embed="rIdW05FigureScreenshot6"/>
+                          <a:stretch>
+                            <a:fillRect/>
+                          </a:stretch>
+                        </pic:blipFill>
+                        <pic:spPr>
+                          <a:xfrm>
+                            <a:off x="0" y="0"/>
+                            <a:ext cx="5623560" cy="1403776"/>
+                          </a:xfrm>
+                          <a:prstGeom prst="rect">
+                            <a:avLst/>
+                          </a:prstGeom>
+                        </pic:spPr>
+                      </pic:pic>
+                    </a:graphicData>
+                  </a:graphic>
+                </wp:inline>
+              </w:drawing>
+            </w:r>
+          </w:p>
+          <w:p>
+            <w:pPr xmlns:w="http://schemas.openxmlformats.org/wordprocessingml/2006/main">
+              <w:keepNext w:val="0"/>
+              <w:spacing w:before="40" w:after="100"/>
+              <w:jc w:val="left"/>
+            </w:pPr>
+            <w:r>
+              <w:rPr xmlns:w="http://schemas.openxmlformats.org/wordprocessingml/2006/main">
+                <w:rFonts w:ascii="Calibri" w:hAnsi="Calibri"/>
+                <w:sz w:val="18"/>
+                <w:color w:val="000000"/>
+              </w:rPr>
+              <w:t>Figure 3d. Original p. 29, section 4.17: +/-4 g has sensitivity 8192 LSB/g, so 1000/8192 = 0.1220703125 mg/LSB. PDF page excerpt.</w:t>
+            </w:r>
+          </w:p>
+        </w:tc>
+      </w:tr>
+    </w:tbl>
+    <w:p>
+      <w:pPr xmlns:w="http://schemas.openxmlformats.org/wordprocessingml/2006/main">
+        <w:keepNext w:val="0"/>
+        <w:spacing w:before="0" w:after="40" w:line="20" w:lineRule="exact"/>
+        <w:rPr>
+          <w:sz w:val="2"/>
+        </w:rPr>
+      </w:pPr>
+    </w:p>
     <w:p>
       <w:pPr>
         <w:keepLines/>
@@ -3426,7 +3722,7 @@
           </w:tcPr>
           <w:p>
             <w:pPr>
-              <w:keepNext/>
+              <w:keepNext w:val="1"/>
               <w:spacing w:before="40" w:after="40"/>
             </w:pPr>
             <w:r>
@@ -3450,7 +3746,7 @@
           </w:tcPr>
           <w:p>
             <w:pPr>
-              <w:keepNext/>
+              <w:keepNext w:val="1"/>
               <w:spacing w:before="40" w:after="40"/>
             </w:pPr>
             <w:r>
@@ -3469,118 +3765,65 @@
         </w:tc>
       </w:tr>
       <w:tr>
-        <w:trPr>
-          <w:cantSplit/>
-          <w:trHeight w:val="2880"/>
-        </w:trPr>
+        <w:trPr/>
         <w:tc>
           <w:tcPr>
             <w:tcW w:w="4680" w:type="dxa"/>
             <w:vAlign w:val="center"/>
           </w:tcPr>
           <w:p>
-            <w:pPr>
-              <w:spacing w:before="0" w:after="80"/>
-              <w:jc w:val="left"/>
-              <w:keepNext w:val="0"/>
-            </w:pPr>
-            <w:r>
-              <w:rPr>
-                <w:rFonts w:hAnsi="Consolas" w:ascii="Consolas" w:eastAsia="Microsoft JhengHei"/>
-                <w:sz w:val="17"/>
-                <w:color w:val="000000"/>
-              </w:rPr>
-              <w:t xml:space="preserve">Saved serial transcript:</w:t>
-            </w:r>
-            <w:r>
-              <w:rPr>
-                <w:rFonts w:hAnsi="Consolas" w:ascii="Consolas" w:eastAsia="Microsoft JhengHei"/>
-                <w:sz w:val="17"/>
-                <w:color w:val="000000"/>
-              </w:rPr>
-              <w:br/>
-              <w:t xml:space="preserve">who_am_i=0x68</w:t>
-            </w:r>
-            <w:r>
-              <w:rPr>
-                <w:rFonts w:hAnsi="Consolas" w:ascii="Consolas" w:eastAsia="Microsoft JhengHei"/>
-                <w:sz w:val="17"/>
-                <w:color w:val="000000"/>
-              </w:rPr>
-              <w:br/>
-              <w:t xml:space="preserve">accel_cfg=0x00 gyro_cfg=0x00</w:t>
-            </w:r>
-            <w:r>
-              <w:rPr>
-                <w:rFonts w:hAnsi="Consolas" w:ascii="Consolas" w:eastAsia="Microsoft JhengHei"/>
-                <w:sz w:val="17"/>
-                <w:color w:val="000000"/>
-              </w:rPr>
-              <w:br/>
-              <w:t xml:space="preserve">gap_us=1</w:t>
-            </w:r>
-            <w:r>
-              <w:rPr>
-                <w:rFonts w:hAnsi="Consolas" w:ascii="Consolas" w:eastAsia="Microsoft JhengHei"/>
-                <w:sz w:val="17"/>
-                <w:color w:val="000000"/>
-              </w:rPr>
-              <w:br/>
-              <w:t xml:space="preserve">frame,raw_x,raw_y,raw_z,g_x,g_y,g_z</w:t>
-            </w:r>
-            <w:r>
-              <w:rPr>
-                <w:rFonts w:hAnsi="Consolas" w:ascii="Consolas" w:eastAsia="Microsoft JhengHei"/>
-                <w:sz w:val="17"/>
-                <w:color w:val="000000"/>
-              </w:rPr>
-              <w:br/>
-              <w:t xml:space="preserve">0,0,0,0,0.000,0.000,0.000</w:t>
-            </w:r>
-            <w:r>
-              <w:rPr>
-                <w:rFonts w:hAnsi="Consolas" w:ascii="Consolas" w:eastAsia="Microsoft JhengHei"/>
-                <w:sz w:val="17"/>
-                <w:color w:val="000000"/>
-              </w:rPr>
-              <w:br/>
-              <w:t xml:space="preserve">1,0,0,0,0.000,0.000,0.000</w:t>
-            </w:r>
-            <w:r>
-              <w:rPr>
-                <w:rFonts w:hAnsi="Consolas" w:ascii="Consolas" w:eastAsia="Microsoft JhengHei"/>
-                <w:sz w:val="17"/>
-                <w:color w:val="000000"/>
-              </w:rPr>
-              <w:br/>
-              <w:t xml:space="preserve">2,0,0,0,0.000,0.000,0.000</w:t>
-            </w:r>
-            <w:r>
-              <w:rPr>
-                <w:rFonts w:hAnsi="Consolas" w:ascii="Consolas" w:eastAsia="Microsoft JhengHei"/>
-                <w:sz w:val="17"/>
-                <w:color w:val="000000"/>
-              </w:rPr>
-              <w:br/>
-              <w:t xml:space="preserve">3,0,0,0,0.000,0.000,0.000</w:t>
-            </w:r>
-            <w:r>
-              <w:rPr>
-                <w:rFonts w:hAnsi="Consolas" w:ascii="Consolas" w:eastAsia="Microsoft JhengHei"/>
-                <w:sz w:val="17"/>
-                <w:color w:val="000000"/>
-              </w:rPr>
-              <w:br/>
-              <w:t xml:space="preserve">4,0,0,0,0.000,0.000,0.000</w:t>
-            </w:r>
-            <w:r>
-              <w:rPr>
-                <w:rFonts w:hAnsi="Consolas" w:ascii="Consolas" w:eastAsia="Microsoft JhengHei"/>
-                <w:sz w:val="17"/>
-                <w:color w:val="000000"/>
-              </w:rPr>
-              <w:br/>
-              <w:t xml:space="preserve">5,0,0,0,0.000,0.000,0.000</w:t>
+            <w:pPr xmlns:w="http://schemas.openxmlformats.org/wordprocessingml/2006/main">
+              <w:keepNext w:val="1"/>
+              <w:jc w:val="center"/>
+              <w:spacing w:before="80" w:after="40"/>
+            </w:pPr>
+            <w:r xmlns:w="http://schemas.openxmlformats.org/wordprocessingml/2006/main">
+              <w:drawing>
+                <wp:inline xmlns:wp="http://schemas.openxmlformats.org/drawingml/2006/wordprocessingDrawing" distT="0" distB="0" distL="0" distR="0">
+                  <wp:extent cx="2697480" cy="1609344"/>
+                  <wp:docPr id="2007" name="Actual W05 source figure 2007" descr="Original application screenshot or labelled original PDF excerpt"/>
+                  <a:graphic xmlns:a="http://schemas.openxmlformats.org/drawingml/2006/main">
+                    <a:graphicData uri="http://schemas.openxmlformats.org/drawingml/2006/picture">
+                      <pic:pic xmlns:pic="http://schemas.openxmlformats.org/drawingml/2006/picture">
+                        <pic:nvPicPr>
+                          <pic:cNvPr id="0" name="W05 figure 2007"/>
+                          <pic:cNvPicPr/>
+                        </pic:nvPicPr>
+                        <pic:blipFill>
+                          <a:blip xmlns:r="http://schemas.openxmlformats.org/officeDocument/2006/relationships" r:embed="rIdW05FigureScreenshot7"/>
+                          <a:stretch>
+                            <a:fillRect/>
+                          </a:stretch>
+                        </pic:blipFill>
+                        <pic:spPr>
+                          <a:xfrm>
+                            <a:off x="0" y="0"/>
+                            <a:ext cx="2697480" cy="1609344"/>
+                          </a:xfrm>
+                          <a:prstGeom prst="rect">
+                            <a:avLst/>
+                          </a:prstGeom>
+                        </pic:spPr>
+                      </pic:pic>
+                    </a:graphicData>
+                  </a:graphic>
+                </wp:inline>
+              </w:drawing>
+            </w:r>
+          </w:p>
+          <w:p>
+            <w:pPr xmlns:w="http://schemas.openxmlformats.org/wordprocessingml/2006/main">
+              <w:keepNext w:val="0"/>
+              <w:spacing w:before="40" w:after="100"/>
+              <w:jc w:val="left"/>
+            </w:pPr>
+            <w:r>
+              <w:rPr xmlns:w="http://schemas.openxmlformats.org/wordprocessingml/2006/main">
+                <w:rFonts w:ascii="Calibri" w:hAnsi="Calibri"/>
+                <w:sz w:val="18"/>
+                <w:color w:val="000000"/>
+              </w:rPr>
+              <w:t>Figure 4a. Original ai-init.txt reopened: identity printed, cfg=0x00,0x00, gap_us=1 and frames 0-5 all zero. Cropped screenshot.</w:t>
             </w:r>
           </w:p>
         </w:tc>
@@ -3590,108 +3833,58 @@
             <w:vAlign w:val="center"/>
           </w:tcPr>
           <w:p>
-            <w:pPr>
-              <w:spacing w:before="0" w:after="80"/>
-              <w:jc w:val="left"/>
-              <w:keepNext w:val="0"/>
-            </w:pPr>
-            <w:r>
-              <w:rPr>
-                <w:rFonts w:hAnsi="Consolas" w:ascii="Consolas" w:eastAsia="Microsoft JhengHei"/>
-                <w:sz w:val="17"/>
-                <w:color w:val="000000"/>
-              </w:rPr>
-              <w:t xml:space="preserve">Saved serial transcript:</w:t>
-            </w:r>
-            <w:r>
-              <w:rPr>
-                <w:rFonts w:hAnsi="Consolas" w:ascii="Consolas" w:eastAsia="Microsoft JhengHei"/>
-                <w:sz w:val="17"/>
-                <w:color w:val="000000"/>
-              </w:rPr>
-              <w:br/>
-              <w:t xml:space="preserve">who_am_i=0x68 expected=0x68</w:t>
-            </w:r>
-            <w:r>
-              <w:rPr>
-                <w:rFonts w:hAnsi="Consolas" w:ascii="Consolas" w:eastAsia="Microsoft JhengHei"/>
-                <w:sz w:val="17"/>
-                <w:color w:val="000000"/>
-              </w:rPr>
-              <w:br/>
-              <w:t xml:space="preserve">gap_us=29974 settled=1</w:t>
-            </w:r>
-            <w:r>
-              <w:rPr>
-                <w:rFonts w:hAnsi="Consolas" w:ascii="Consolas" w:eastAsia="Microsoft JhengHei"/>
-                <w:sz w:val="17"/>
-                <w:color w:val="000000"/>
-              </w:rPr>
-              <w:br/>
-              <w:t xml:space="preserve">pwr=0x00 cfg=0x08,0x08</w:t>
-            </w:r>
-            <w:r>
-              <w:rPr>
-                <w:rFonts w:hAnsi="Consolas" w:ascii="Consolas" w:eastAsia="Microsoft JhengHei"/>
-                <w:sz w:val="17"/>
-                <w:color w:val="000000"/>
-              </w:rPr>
-              <w:br/>
-              <w:t xml:space="preserve">frame,raw_x,raw_y,raw_z,g_x,g_y,g_z</w:t>
-            </w:r>
-            <w:r>
-              <w:rPr>
-                <w:rFonts w:hAnsi="Consolas" w:ascii="Consolas" w:eastAsia="Microsoft JhengHei"/>
-                <w:sz w:val="17"/>
-                <w:color w:val="000000"/>
-              </w:rPr>
-              <w:br/>
-              <w:t xml:space="preserve">0,1790,320,9140,0.219,0.039,1.116</w:t>
-            </w:r>
-            <w:r>
-              <w:rPr>
-                <w:rFonts w:hAnsi="Consolas" w:ascii="Consolas" w:eastAsia="Microsoft JhengHei"/>
-                <w:sz w:val="17"/>
-                <w:color w:val="000000"/>
-              </w:rPr>
-              <w:br/>
-              <w:t xml:space="preserve">1,1836,396,9154,0.224,0.048,1.117</w:t>
-            </w:r>
-            <w:r>
-              <w:rPr>
-                <w:rFonts w:hAnsi="Consolas" w:ascii="Consolas" w:eastAsia="Microsoft JhengHei"/>
-                <w:sz w:val="17"/>
-                <w:color w:val="000000"/>
-              </w:rPr>
-              <w:br/>
-              <w:t xml:space="preserve">2,1794,360,9164,0.219,0.044,1.119</w:t>
-            </w:r>
-            <w:r>
-              <w:rPr>
-                <w:rFonts w:hAnsi="Consolas" w:ascii="Consolas" w:eastAsia="Microsoft JhengHei"/>
-                <w:sz w:val="17"/>
-                <w:color w:val="000000"/>
-              </w:rPr>
-              <w:br/>
-              <w:t xml:space="preserve">3,1770,342,9190,0.216,0.042,1.122</w:t>
-            </w:r>
-            <w:r>
-              <w:rPr>
-                <w:rFonts w:hAnsi="Consolas" w:ascii="Consolas" w:eastAsia="Microsoft JhengHei"/>
-                <w:sz w:val="17"/>
-                <w:color w:val="000000"/>
-              </w:rPr>
-              <w:br/>
-              <w:t xml:space="preserve">4,1780,336,9192,0.217,0.041,1.122</w:t>
-            </w:r>
-            <w:r>
-              <w:rPr>
-                <w:rFonts w:hAnsi="Consolas" w:ascii="Consolas" w:eastAsia="Microsoft JhengHei"/>
-                <w:sz w:val="17"/>
-                <w:color w:val="000000"/>
-              </w:rPr>
-              <w:br/>
-              <w:t xml:space="preserve">5,1740,390,9190,0.212,0.048,1.122</w:t>
+            <w:pPr xmlns:w="http://schemas.openxmlformats.org/wordprocessingml/2006/main">
+              <w:keepNext w:val="1"/>
+              <w:jc w:val="center"/>
+              <w:spacing w:before="80" w:after="40"/>
+            </w:pPr>
+            <w:r xmlns:w="http://schemas.openxmlformats.org/wordprocessingml/2006/main">
+              <w:drawing>
+                <wp:inline xmlns:wp="http://schemas.openxmlformats.org/drawingml/2006/wordprocessingDrawing" distT="0" distB="0" distL="0" distR="0">
+                  <wp:extent cx="2697480" cy="1609344"/>
+                  <wp:docPr id="2008" name="Actual W05 source figure 2008" descr="Original application screenshot or labelled original PDF excerpt"/>
+                  <a:graphic xmlns:a="http://schemas.openxmlformats.org/drawingml/2006/main">
+                    <a:graphicData uri="http://schemas.openxmlformats.org/drawingml/2006/picture">
+                      <pic:pic xmlns:pic="http://schemas.openxmlformats.org/drawingml/2006/picture">
+                        <pic:nvPicPr>
+                          <pic:cNvPr id="0" name="W05 figure 2008"/>
+                          <pic:cNvPicPr/>
+                        </pic:nvPicPr>
+                        <pic:blipFill>
+                          <a:blip xmlns:r="http://schemas.openxmlformats.org/officeDocument/2006/relationships" r:embed="rIdW05FigureScreenshot8"/>
+                          <a:stretch>
+                            <a:fillRect/>
+                          </a:stretch>
+                        </pic:blipFill>
+                        <pic:spPr>
+                          <a:xfrm>
+                            <a:off x="0" y="0"/>
+                            <a:ext cx="2697480" cy="1609344"/>
+                          </a:xfrm>
+                          <a:prstGeom prst="rect">
+                            <a:avLst/>
+                          </a:prstGeom>
+                        </pic:spPr>
+                      </pic:pic>
+                    </a:graphicData>
+                  </a:graphic>
+                </wp:inline>
+              </w:drawing>
+            </w:r>
+          </w:p>
+          <w:p>
+            <w:pPr xmlns:w="http://schemas.openxmlformats.org/wordprocessingml/2006/main">
+              <w:keepNext w:val="0"/>
+              <w:spacing w:before="40" w:after="100"/>
+              <w:jc w:val="left"/>
+            </w:pPr>
+            <w:r>
+              <w:rPr xmlns:w="http://schemas.openxmlformats.org/wordprocessingml/2006/main">
+                <w:rFonts w:ascii="Calibri" w:hAnsi="Calibri"/>
+                <w:sz w:val="18"/>
+                <w:color w:val="000000"/>
+              </w:rPr>
+              <w:t>Figure 4b. Original fixed.txt reopened: checked identity, settled=1, correct readback and frames 0-5 with Z approximately 1 g. Cropped screenshot.</w:t>
             </w:r>
           </w:p>
         </w:tc>
@@ -4361,7 +4554,7 @@
           </w:tcPr>
           <w:p>
             <w:pPr>
-              <w:keepNext/>
+              <w:keepNext w:val="1"/>
               <w:spacing w:before="40" w:after="40"/>
             </w:pPr>
             <w:r>
@@ -4371,127 +4564,65 @@
         </w:tc>
       </w:tr>
       <w:tr>
-        <w:trPr>
-          <w:cantSplit/>
-          <w:trHeight w:val="2160"/>
-        </w:trPr>
+        <w:trPr/>
         <w:tc>
           <w:tcPr>
             <w:tcW w:w="9360" w:type="dxa"/>
             <w:vAlign w:val="center"/>
           </w:tcPr>
           <w:p>
-            <w:pPr>
-              <w:spacing w:before="0" w:after="80"/>
-              <w:jc w:val="left"/>
-              <w:keepNext w:val="0"/>
-            </w:pPr>
-            <w:r>
-              <w:rPr>
-                <w:rFonts w:hAnsi="Consolas" w:ascii="Consolas" w:eastAsia="Microsoft JhengHei"/>
-                <w:sz w:val="16"/>
-                <w:color w:val="000000"/>
-              </w:rPr>
-              <w:t xml:space="preserve">Local build output, 2026-10-15; espressif32@7.1.3, esp32-s3-devkitc-1</w:t>
-            </w:r>
-            <w:r>
-              <w:rPr>
-                <w:rFonts w:hAnsi="Consolas" w:ascii="Consolas" w:eastAsia="Microsoft JhengHei"/>
-                <w:sz w:val="16"/>
-                <w:color w:val="000000"/>
-              </w:rPr>
-              <w:br/>
-              <w:t xml:space="preserve">build-sketch3-homework5-20261015.log</w:t>
-            </w:r>
-            <w:r>
-              <w:rPr>
-                <w:rFonts w:hAnsi="Consolas" w:ascii="Consolas" w:eastAsia="Microsoft JhengHei"/>
-                <w:sz w:val="16"/>
-                <w:color w:val="000000"/>
-              </w:rPr>
-              <w:br/>
-              <w:t xml:space="preserve">RAM:   [=         ]   5.7% (used 18760 bytes from 327680 bytes)</w:t>
-            </w:r>
-            <w:r>
-              <w:rPr>
-                <w:rFonts w:hAnsi="Consolas" w:ascii="Consolas" w:eastAsia="Microsoft JhengHei"/>
-                <w:sz w:val="16"/>
-                <w:color w:val="000000"/>
-              </w:rPr>
-              <w:br/>
-              <w:t xml:space="preserve">Flash: [=         ]   8.5% (used 283877 bytes from 3342336 bytes)</w:t>
-            </w:r>
-            <w:r>
-              <w:rPr>
-                <w:rFonts w:hAnsi="Consolas" w:ascii="Consolas" w:eastAsia="Microsoft JhengHei"/>
-                <w:sz w:val="16"/>
-                <w:color w:val="000000"/>
-              </w:rPr>
-              <w:br/>
-              <w:t xml:space="preserve"/>
-            </w:r>
-            <w:r>
-              <w:rPr>
-                <w:rFonts w:hAnsi="Consolas" w:ascii="Consolas" w:eastAsia="Microsoft JhengHei"/>
-                <w:sz w:val="16"/>
-                <w:color w:val="000000"/>
-              </w:rPr>
-              <w:br/>
-              <w:t xml:space="preserve">build-sketch4-blank-homework5-verified-20261015.log</w:t>
-            </w:r>
-            <w:r>
-              <w:rPr>
-                <w:rFonts w:hAnsi="Consolas" w:ascii="Consolas" w:eastAsia="Microsoft JhengHei"/>
-                <w:sz w:val="16"/>
-                <w:color w:val="000000"/>
-              </w:rPr>
-              <w:br/>
-              <w:t xml:space="preserve">RAM:   [=         ]   5.7% (used 18760 bytes from 327680 bytes)</w:t>
-            </w:r>
-            <w:r>
-              <w:rPr>
-                <w:rFonts w:hAnsi="Consolas" w:ascii="Consolas" w:eastAsia="Microsoft JhengHei"/>
-                <w:sz w:val="16"/>
-                <w:color w:val="000000"/>
-              </w:rPr>
-              <w:br/>
-              <w:t xml:space="preserve">Flash: [=         ]   8.5% (used 284969 bytes from 3342336 bytes)</w:t>
-            </w:r>
-            <w:r>
-              <w:rPr>
-                <w:rFonts w:hAnsi="Consolas" w:ascii="Consolas" w:eastAsia="Microsoft JhengHei"/>
-                <w:sz w:val="16"/>
-                <w:color w:val="000000"/>
-              </w:rPr>
-              <w:br/>
-              <w:t xml:space="preserve"/>
-            </w:r>
-            <w:r>
-              <w:rPr>
-                <w:rFonts w:hAnsi="Consolas" w:ascii="Consolas" w:eastAsia="Microsoft JhengHei"/>
-                <w:sz w:val="16"/>
-                <w:color w:val="000000"/>
-              </w:rPr>
-              <w:br/>
-              <w:t xml:space="preserve">build-sketch4-filled-homework5-verified-20261015.log</w:t>
-            </w:r>
-            <w:r>
-              <w:rPr>
-                <w:rFonts w:hAnsi="Consolas" w:ascii="Consolas" w:eastAsia="Microsoft JhengHei"/>
-                <w:sz w:val="16"/>
-                <w:color w:val="000000"/>
-              </w:rPr>
-              <w:br/>
-              <w:t xml:space="preserve">RAM:   [=         ]   5.7% (used 18760 bytes from 327680 bytes)</w:t>
-            </w:r>
-            <w:r>
-              <w:rPr>
-                <w:rFonts w:hAnsi="Consolas" w:ascii="Consolas" w:eastAsia="Microsoft JhengHei"/>
-                <w:sz w:val="16"/>
-                <w:color w:val="000000"/>
-              </w:rPr>
-              <w:br/>
-              <w:t xml:space="preserve">Flash: [=         ]   8.5% (used 284969 bytes from 3342336 bytes)</w:t>
+            <w:pPr xmlns:w="http://schemas.openxmlformats.org/wordprocessingml/2006/main">
+              <w:keepNext w:val="1"/>
+              <w:jc w:val="center"/>
+              <w:spacing w:before="80" w:after="40"/>
+            </w:pPr>
+            <w:r xmlns:w="http://schemas.openxmlformats.org/wordprocessingml/2006/main">
+              <w:drawing>
+                <wp:inline xmlns:wp="http://schemas.openxmlformats.org/drawingml/2006/wordprocessingDrawing" distT="0" distB="0" distL="0" distR="0">
+                  <wp:extent cx="5623560" cy="2154621"/>
+                  <wp:docPr id="2009" name="Actual W05 source figure 2009" descr="Original application screenshot or labelled original PDF excerpt"/>
+                  <a:graphic xmlns:a="http://schemas.openxmlformats.org/drawingml/2006/main">
+                    <a:graphicData uri="http://schemas.openxmlformats.org/drawingml/2006/picture">
+                      <pic:pic xmlns:pic="http://schemas.openxmlformats.org/drawingml/2006/picture">
+                        <pic:nvPicPr>
+                          <pic:cNvPr id="0" name="W05 figure 2009"/>
+                          <pic:cNvPicPr/>
+                        </pic:nvPicPr>
+                        <pic:blipFill>
+                          <a:blip xmlns:r="http://schemas.openxmlformats.org/officeDocument/2006/relationships" r:embed="rIdW05FigureScreenshot9"/>
+                          <a:stretch>
+                            <a:fillRect/>
+                          </a:stretch>
+                        </pic:blipFill>
+                        <pic:spPr>
+                          <a:xfrm>
+                            <a:off x="0" y="0"/>
+                            <a:ext cx="5623560" cy="2154621"/>
+                          </a:xfrm>
+                          <a:prstGeom prst="rect">
+                            <a:avLst/>
+                          </a:prstGeom>
+                        </pic:spPr>
+                      </pic:pic>
+                    </a:graphicData>
+                  </a:graphic>
+                </wp:inline>
+              </w:drawing>
+            </w:r>
+          </w:p>
+          <w:p>
+            <w:pPr xmlns:w="http://schemas.openxmlformats.org/wordprocessingml/2006/main">
+              <w:keepNext w:val="0"/>
+              <w:spacing w:before="40" w:after="100"/>
+              <w:jc w:val="left"/>
+            </w:pPr>
+            <w:r>
+              <w:rPr xmlns:w="http://schemas.openxmlformats.org/wordprocessingml/2006/main">
+                <w:rFonts w:ascii="Calibri" w:hAnsi="Calibri"/>
+                <w:sz w:val="18"/>
+                <w:color w:val="000000"/>
+              </w:rPr>
+              <w:t>Figure 5. Screenshot of verbatim RAM, Flash and SUCCESS lines from the saved 2026-10-15 build logs: Sketch 3, Sketch 4 with zero blanks, and Sketch 4 filled. Only descriptive block labels were added.</w:t>
             </w:r>
           </w:p>
         </w:tc>
@@ -7028,7 +7159,7 @@
       </w:tr>
       <w:tr>
         <w:trPr>
-          <w:trHeight w:val="2880"/>
+          <w:cantSplit/>
         </w:trPr>
         <w:tc>
           <w:tcPr>
@@ -7037,177 +7168,88 @@
             <w:gridSpan w:val="2"/>
           </w:tcPr>
           <w:p>
-            <w:pPr>
-              <w:jc w:val="left"/>
+            <w:pPr xmlns:w="http://schemas.openxmlformats.org/wordprocessingml/2006/main">
               <w:keepNext w:val="1"/>
-              <w:spacing w:before="0" w:after="80"/>
-            </w:pPr>
-            <w:r>
-              <w:rPr>
-                <w:rFonts w:hAnsi="Calibri" w:ascii="Calibri" w:eastAsia="Microsoft JhengHei"/>
-                <w:sz w:val="18"/>
-                <w:color w:val="000000"/>
-              </w:rPr>
-              <w:t xml:space="preserve">Figure 7a. Verbatim crosscheck.py output below (file-path line omitted). Input serial log: w05/whoami-20261019-165030-serial.txt, captured during the same reset as the analyser trace.</w:t>
-            </w:r>
-          </w:p>
-          <w:p>
-            <w:pPr>
-              <w:jc w:val="left"/>
-              <w:keepNext w:val="0"/>
-              <w:spacing w:before="0" w:after="100"/>
-            </w:pPr>
-            <w:r>
-              <w:rPr>
-                <w:rFonts w:hAnsi="Consolas" w:ascii="Consolas" w:eastAsia="Microsoft JhengHei"/>
-                <w:sz w:val="17"/>
-                <w:color w:val="000000"/>
-              </w:rPr>
-              <w:t xml:space="preserve">WHO_AM_I read         0x68  expected 0x68</w:t>
-            </w:r>
-            <w:r>
-              <w:rPr>
-                <w:rFonts w:hAnsi="Consolas" w:ascii="Consolas" w:eastAsia="Microsoft JhengHei"/>
-                <w:sz w:val="17"/>
-                <w:color w:val="000000"/>
-              </w:rPr>
-              <w:br/>
-              <w:t xml:space="preserve">settled flag          1</w:t>
-            </w:r>
-            <w:r>
-              <w:rPr>
-                <w:rFonts w:hAnsi="Consolas" w:ascii="Consolas" w:eastAsia="Microsoft JhengHei"/>
-                <w:sz w:val="17"/>
-                <w:color w:val="000000"/>
-              </w:rPr>
-              <w:br/>
-              <w:t xml:space="preserve">halt line             none</w:t>
-            </w:r>
-            <w:r>
-              <w:rPr>
-                <w:rFonts w:hAnsi="Consolas" w:ascii="Consolas" w:eastAsia="Microsoft JhengHei"/>
-                <w:sz w:val="17"/>
-                <w:color w:val="000000"/>
-              </w:rPr>
-              <w:br/>
-              <w:t xml:space="preserve">gap, board  micros()  29974</w:t>
-            </w:r>
-            <w:r>
-              <w:rPr>
-                <w:rFonts w:hAnsi="Consolas" w:ascii="Consolas" w:eastAsia="Microsoft JhengHei"/>
-                <w:sz w:val="17"/>
-                <w:color w:val="000000"/>
-              </w:rPr>
-              <w:br/>
-              <w:t xml:space="preserve">gap, analyser         30028</w:t>
-            </w:r>
-            <w:r>
-              <w:rPr>
-                <w:rFonts w:hAnsi="Consolas" w:ascii="Consolas" w:eastAsia="Microsoft JhengHei"/>
-                <w:sz w:val="17"/>
-                <w:color w:val="000000"/>
-              </w:rPr>
-              <w:br/>
-              <w:t xml:space="preserve"/>
-            </w:r>
-            <w:r>
-              <w:rPr>
-                <w:rFonts w:hAnsi="Consolas" w:ascii="Consolas" w:eastAsia="Microsoft JhengHei"/>
-                <w:sz w:val="17"/>
-                <w:color w:val="000000"/>
-              </w:rPr>
-              <w:br/>
-              <w:t xml:space="preserve">gap, board  micros()     29974.0 us</w:t>
-            </w:r>
-            <w:r>
-              <w:rPr>
-                <w:rFonts w:hAnsi="Consolas" w:ascii="Consolas" w:eastAsia="Microsoft JhengHei"/>
-                <w:sz w:val="17"/>
-                <w:color w:val="000000"/>
-              </w:rPr>
-              <w:br/>
-              <w:t xml:space="preserve">gap, analyser            30028.0 us</w:t>
-            </w:r>
-            <w:r>
-              <w:rPr>
-                <w:rFonts w:hAnsi="Consolas" w:ascii="Consolas" w:eastAsia="Microsoft JhengHei"/>
-                <w:sz w:val="17"/>
-                <w:color w:val="000000"/>
-              </w:rPr>
-              <w:br/>
-              <w:t xml:space="preserve">difference                  54.0 us  (+0.18% of the board's number)</w:t>
-            </w:r>
-            <w:r>
-              <w:rPr>
-                <w:rFonts w:hAnsi="Consolas" w:ascii="Consolas" w:eastAsia="Microsoft JhengHei"/>
-                <w:sz w:val="17"/>
-                <w:color w:val="000000"/>
-              </w:rPr>
-              <w:br/>
-              <w:t xml:space="preserve">tolerance                  599.5 us  (2.0% or 20 us, whichever is larger)</w:t>
-            </w:r>
-            <w:r>
-              <w:rPr>
-                <w:rFonts w:hAnsi="Consolas" w:ascii="Consolas" w:eastAsia="Microsoft JhengHei"/>
-                <w:sz w:val="17"/>
-                <w:color w:val="000000"/>
-              </w:rPr>
-              <w:br/>
-              <w:t xml:space="preserve"/>
-            </w:r>
-            <w:r>
-              <w:rPr>
-                <w:rFonts w:hAnsi="Consolas" w:ascii="Consolas" w:eastAsia="Microsoft JhengHei"/>
-                <w:sz w:val="17"/>
-                <w:color w:val="000000"/>
-              </w:rPr>
-              <w:br/>
-              <w:t xml:space="preserve">AGREE, within the tolerance stated at the top of this file.</w:t>
-            </w:r>
-            <w:r>
-              <w:rPr>
-                <w:rFonts w:hAnsi="Consolas" w:ascii="Consolas" w:eastAsia="Microsoft JhengHei"/>
-                <w:sz w:val="17"/>
-                <w:color w:val="000000"/>
-              </w:rPr>
-              <w:br/>
-              <w:t xml:space="preserve"/>
-            </w:r>
-            <w:r>
-              <w:rPr>
-                <w:rFonts w:hAnsi="Consolas" w:ascii="Consolas" w:eastAsia="Microsoft JhengHei"/>
-                <w:sz w:val="17"/>
-                <w:color w:val="000000"/>
-              </w:rPr>
-              <w:br/>
-              <w:t xml:space="preserve">Two clocks that never met produced the two numbers above. Say on the record</w:t>
-            </w:r>
-            <w:r>
-              <w:rPr>
-                <w:rFonts w:hAnsi="Consolas" w:ascii="Consolas" w:eastAsia="Microsoft JhengHei"/>
-                <w:sz w:val="17"/>
-                <w:color w:val="000000"/>
-              </w:rPr>
-              <w:br/>
-              <w:t xml:space="preserve">sheet whether that is close enough for what you are claiming, and why.</w:t>
-            </w:r>
-          </w:p>
-          <w:p>
-            <w:pPr xmlns:w="http://schemas.openxmlformats.org/wordprocessingml/2006/main">
               <w:jc w:val="center"/>
-              <w:keepNext w:val="1"/>
               <w:spacing w:before="80" w:after="40"/>
             </w:pPr>
             <w:r xmlns:w="http://schemas.openxmlformats.org/wordprocessingml/2006/main">
               <w:drawing>
                 <wp:inline xmlns:wp="http://schemas.openxmlformats.org/drawingml/2006/wordprocessingDrawing" distT="0" distB="0" distL="0" distR="0">
-                  <wp:extent cx="5715000" cy="3056860"/>
-                  <wp:docPr id="1003" name="W05 actual instrument figure 3" descr="Actual PulseView capture cropped for readability"/>
+                  <wp:extent cx="5623560" cy="2404420"/>
+                  <wp:docPr id="2010" name="Actual W05 source figure 2010" descr="Original application screenshot or labelled original PDF excerpt"/>
                   <a:graphic xmlns:a="http://schemas.openxmlformats.org/drawingml/2006/main">
                     <a:graphicData uri="http://schemas.openxmlformats.org/drawingml/2006/picture">
                       <pic:pic xmlns:pic="http://schemas.openxmlformats.org/drawingml/2006/picture">
                         <pic:nvPicPr>
-                          <pic:cNvPr id="0" name="w05-closeout-3.png"/>
+                          <pic:cNvPr id="0" name="W05 figure 2010"/>
+                          <pic:cNvPicPr/>
+                        </pic:nvPicPr>
+                        <pic:blipFill>
+                          <a:blip xmlns:r="http://schemas.openxmlformats.org/officeDocument/2006/relationships" r:embed="rIdW05FigureScreenshot10"/>
+                          <a:stretch>
+                            <a:fillRect/>
+                          </a:stretch>
+                        </pic:blipFill>
+                        <pic:spPr>
+                          <a:xfrm>
+                            <a:off x="0" y="0"/>
+                            <a:ext cx="5623560" cy="2404420"/>
+                          </a:xfrm>
+                          <a:prstGeom prst="rect">
+                            <a:avLst/>
+                          </a:prstGeom>
+                        </pic:spPr>
+                      </pic:pic>
+                    </a:graphicData>
+                  </a:graphic>
+                </wp:inline>
+              </w:drawing>
+            </w:r>
+          </w:p>
+          <w:p>
+            <w:pPr xmlns:w="http://schemas.openxmlformats.org/wordprocessingml/2006/main">
+              <w:keepNext w:val="0"/>
+              <w:spacing w:before="40" w:after="100"/>
+              <w:jc w:val="left"/>
+            </w:pPr>
+            <w:r>
+              <w:rPr xmlns:w="http://schemas.openxmlformats.org/wordprocessingml/2006/main">
+                <w:rFonts w:ascii="Calibri" w:hAnsi="Calibri"/>
+                <w:sz w:val="18"/>
+                <w:color w:val="000000"/>
+              </w:rPr>
+              <w:t>Figure 7a. Saved crosscheck.py stdout reopened in Notepad, including the input log path and complete AGREE verdict. Same-reset values: board 29974 us, analyser 30028 us, difference +54 us (+0.18%). Cropped screenshot.</w:t>
+            </w:r>
+          </w:p>
+        </w:tc>
+      </w:tr>
+      <w:tr>
+        <w:trPr>
+          <w:cantSplit/>
+        </w:trPr>
+        <w:tc>
+          <w:tcPr>
+            <w:tcW w:w="9360" w:type="dxa"/>
+            <w:vAlign w:val="center"/>
+            <w:gridSpan w:val="2"/>
+          </w:tcPr>
+          <w:p>
+            <w:pPr xmlns:w="http://schemas.openxmlformats.org/wordprocessingml/2006/main">
+              <w:keepNext w:val="1"/>
+              <w:jc w:val="center"/>
+              <w:spacing w:before="80" w:after="40"/>
+            </w:pPr>
+            <w:r xmlns:w="http://schemas.openxmlformats.org/wordprocessingml/2006/main">
+              <w:drawing>
+                <wp:inline xmlns:wp="http://schemas.openxmlformats.org/drawingml/2006/wordprocessingDrawing" distT="0" distB="0" distL="0" distR="0">
+                  <wp:extent cx="5623560" cy="3007951"/>
+                  <wp:docPr id="2011" name="Actual W05 source figure 2011" descr="Original application screenshot or labelled original PDF excerpt"/>
+                  <a:graphic xmlns:a="http://schemas.openxmlformats.org/drawingml/2006/main">
+                    <a:graphicData uri="http://schemas.openxmlformats.org/drawingml/2006/picture">
+                      <pic:pic xmlns:pic="http://schemas.openxmlformats.org/drawingml/2006/picture">
+                        <pic:nvPicPr>
+                          <pic:cNvPr id="0" name="W05 figure 2011"/>
                           <pic:cNvPicPr/>
                         </pic:nvPicPr>
                         <pic:blipFill>
@@ -7219,7 +7261,7 @@
                         <pic:spPr>
                           <a:xfrm>
                             <a:off x="0" y="0"/>
-                            <a:ext cx="5715000" cy="3056860"/>
+                            <a:ext cx="5623560" cy="3007951"/>
                           </a:xfrm>
                           <a:prstGeom prst="rect">
                             <a:avLst/>
@@ -7233,18 +7275,18 @@
             </w:r>
           </w:p>
           <w:p>
-            <w:pPr>
-              <w:jc w:val="left"/>
-              <w:keepNext w:val="0"/>
-              <w:spacing w:before="0" w:after="80"/>
-            </w:pPr>
-            <w:r>
-              <w:rPr>
-                <w:rFonts w:hAnsi="Calibri" w:ascii="Calibri" w:eastAsia="Microsoft JhengHei"/>
+            <w:pPr xmlns:w="http://schemas.openxmlformats.org/wordprocessingml/2006/main">
+              <w:keepNext w:val="0"/>
+              <w:spacing w:before="40" w:after="100"/>
+              <w:jc w:val="left"/>
+            </w:pPr>
+            <w:r>
+              <w:rPr xmlns:w="http://schemas.openxmlformats.org/wordprocessingml/2006/main">
+                <w:rFonts w:ascii="Calibri" w:hAnsi="Calibri"/>
                 <w:sz w:val="18"/>
                 <w:color w:val="000000"/>
               </w:rPr>
-              <w:t xml:space="preserve">Figure 7b. Final configuration STOP (2.349362 s) to first 0x3B-read START (2.379390 s): delta 30.028 ms = 30,028 us. PulseView screenshot cropped for readability; full original: w05/gap-cursors.png.</w:t>
+              <w:t>Figure 7b. Actual PulseView cursors from final configuration STOP (2.349362 s) to first 0x3B-read START (2.379390 s): 30.028 ms = 30028 us. Original instrument screenshot retained in w05/gap-cursors.png.</w:t>
             </w:r>
           </w:p>
         </w:tc>
@@ -7739,7 +7781,7 @@
           </w:tcPr>
           <w:p>
             <w:pPr>
-              <w:keepNext/>
+              <w:keepNext w:val="1"/>
               <w:spacing w:before="40" w:after="40"/>
             </w:pPr>
             <w:r>
@@ -7749,73 +7791,65 @@
         </w:tc>
       </w:tr>
       <w:tr>
-        <w:trPr>
-          <w:cantSplit/>
-          <w:trHeight w:val="2160"/>
-        </w:trPr>
+        <w:trPr/>
         <w:tc>
           <w:tcPr>
             <w:tcW w:w="9360" w:type="dxa"/>
             <w:vAlign w:val="center"/>
           </w:tcPr>
           <w:p>
-            <w:pPr>
-              <w:spacing w:before="0" w:after="80"/>
-              <w:jc w:val="left"/>
-              <w:keepNext w:val="0"/>
-            </w:pPr>
-            <w:r>
-              <w:rPr>
-                <w:rFonts w:hAnsi="Consolas" w:ascii="Consolas" w:eastAsia="Microsoft JhengHei"/>
-                <w:sz w:val="16"/>
-                <w:color w:val="000000"/>
-              </w:rPr>
-              <w:t xml:space="preserve">Saved serial transcript — w05/stream.txt</w:t>
-            </w:r>
-            <w:r>
-              <w:rPr>
-                <w:rFonts w:hAnsi="Consolas" w:ascii="Consolas" w:eastAsia="Microsoft JhengHei"/>
-                <w:sz w:val="16"/>
-                <w:color w:val="000000"/>
-              </w:rPr>
-              <w:br/>
-              <w:t xml:space="preserve">run,clock_hz,delay_ms_per_read,seconds,attempts,ok,failed,bytes,reads_per_s</w:t>
-            </w:r>
-            <w:r>
-              <w:rPr>
-                <w:rFonts w:hAnsi="Consolas" w:ascii="Consolas" w:eastAsia="Microsoft JhengHei"/>
-                <w:sz w:val="16"/>
-                <w:color w:val="000000"/>
-              </w:rPr>
-              <w:br/>
-              <w:t xml:space="preserve">1,100000,0,3,3288,3288,0,19728,1096.0</w:t>
-            </w:r>
-            <w:r>
-              <w:rPr>
-                <w:rFonts w:hAnsi="Consolas" w:ascii="Consolas" w:eastAsia="Microsoft JhengHei"/>
-                <w:sz w:val="16"/>
-                <w:color w:val="000000"/>
-              </w:rPr>
-              <w:br/>
-              <w:t xml:space="preserve">2,400000,0,3,11181,11181,0,67086,3727.0</w:t>
-            </w:r>
-            <w:r>
-              <w:rPr>
-                <w:rFonts w:hAnsi="Consolas" w:ascii="Consolas" w:eastAsia="Microsoft JhengHei"/>
-                <w:sz w:val="16"/>
-                <w:color w:val="000000"/>
-              </w:rPr>
-              <w:br/>
-              <w:t xml:space="preserve">3,400000,1,3,3000,3000,0,18000,1000.0</w:t>
-            </w:r>
-            <w:r>
-              <w:rPr>
-                <w:rFonts w:hAnsi="Consolas" w:ascii="Consolas" w:eastAsia="Microsoft JhengHei"/>
-                <w:sz w:val="16"/>
-                <w:color w:val="000000"/>
-              </w:rPr>
-              <w:br/>
-              <w:t xml:space="preserve">All three rows have failed=0. These are bus read rates, not fresh-sample rates.</w:t>
+            <w:pPr xmlns:w="http://schemas.openxmlformats.org/wordprocessingml/2006/main">
+              <w:keepNext w:val="1"/>
+              <w:jc w:val="center"/>
+              <w:spacing w:before="80" w:after="40"/>
+            </w:pPr>
+            <w:r xmlns:w="http://schemas.openxmlformats.org/wordprocessingml/2006/main">
+              <w:drawing>
+                <wp:inline xmlns:wp="http://schemas.openxmlformats.org/drawingml/2006/wordprocessingDrawing" distT="0" distB="0" distL="0" distR="0">
+                  <wp:extent cx="5623560" cy="1120195"/>
+                  <wp:docPr id="2012" name="Actual W05 source figure 2012" descr="Original application screenshot or labelled original PDF excerpt"/>
+                  <a:graphic xmlns:a="http://schemas.openxmlformats.org/drawingml/2006/main">
+                    <a:graphicData uri="http://schemas.openxmlformats.org/drawingml/2006/picture">
+                      <pic:pic xmlns:pic="http://schemas.openxmlformats.org/drawingml/2006/picture">
+                        <pic:nvPicPr>
+                          <pic:cNvPr id="0" name="W05 figure 2012"/>
+                          <pic:cNvPicPr/>
+                        </pic:nvPicPr>
+                        <pic:blipFill>
+                          <a:blip xmlns:r="http://schemas.openxmlformats.org/officeDocument/2006/relationships" r:embed="rIdW05FigureScreenshot12"/>
+                          <a:stretch>
+                            <a:fillRect/>
+                          </a:stretch>
+                        </pic:blipFill>
+                        <pic:spPr>
+                          <a:xfrm>
+                            <a:off x="0" y="0"/>
+                            <a:ext cx="5623560" cy="1120195"/>
+                          </a:xfrm>
+                          <a:prstGeom prst="rect">
+                            <a:avLst/>
+                          </a:prstGeom>
+                        </pic:spPr>
+                      </pic:pic>
+                    </a:graphicData>
+                  </a:graphic>
+                </wp:inline>
+              </w:drawing>
+            </w:r>
+          </w:p>
+          <w:p>
+            <w:pPr xmlns:w="http://schemas.openxmlformats.org/wordprocessingml/2006/main">
+              <w:keepNext w:val="0"/>
+              <w:spacing w:before="40" w:after="100"/>
+              <w:jc w:val="left"/>
+            </w:pPr>
+            <w:r>
+              <w:rPr xmlns:w="http://schemas.openxmlformats.org/wordprocessingml/2006/main">
+                <w:rFonts w:ascii="Calibri" w:hAnsi="Calibri"/>
+                <w:sz w:val="18"/>
+                <w:color w:val="000000"/>
+              </w:rPr>
+              <w:t>Figure 8. Original w05/stream.txt reopened in Notepad: all three rows have failed=0 and rates 1096.0, 3727.0 and 1000.0 reads/s. The original bus-rate/ODR note is retained. Cropped screenshot.</w:t>
             </w:r>
           </w:p>
         </w:tc>

</xml_diff>

<commit_message>
Clarify W05 gap figure with SDA SCL labels and endpoint views
</commit_message>
<xml_diff>
--- a/w05/Embedded System - Homework Week 5 - NQ6141054 - Completed.docx
+++ b/w05/Embedded System - Homework Week 5 - NQ6141054 - Completed.docx
@@ -7243,8 +7243,8 @@
             <w:r xmlns:w="http://schemas.openxmlformats.org/wordprocessingml/2006/main">
               <w:drawing>
                 <wp:inline xmlns:wp="http://schemas.openxmlformats.org/drawingml/2006/wordprocessingDrawing" distT="0" distB="0" distL="0" distR="0">
-                  <wp:extent cx="5623560" cy="3007951"/>
-                  <wp:docPr id="2011" name="Actual W05 source figure 2011" descr="Original application screenshot or labelled original PDF excerpt"/>
+                  <wp:extent cx="5623560" cy="3950435"/>
+                  <wp:docPr id="2011" name="Actual W05 source figure 2011" descr="Genuine PulseView screenshots: SDA and SCL overview with 30.028 ms cursor interval, final configuration STOP and first 0x3B read START details. Different time scales; same physical capture."/>
                   <a:graphic xmlns:a="http://schemas.openxmlformats.org/drawingml/2006/main">
                     <a:graphicData uri="http://schemas.openxmlformats.org/drawingml/2006/picture">
                       <pic:pic xmlns:pic="http://schemas.openxmlformats.org/drawingml/2006/picture">
@@ -7261,7 +7261,7 @@
                         <pic:spPr>
                           <a:xfrm>
                             <a:off x="0" y="0"/>
-                            <a:ext cx="5623560" cy="3007951"/>
+                            <a:ext cx="5623560" cy="3950435"/>
                           </a:xfrm>
                           <a:prstGeom prst="rect">
                             <a:avLst/>
@@ -7286,7 +7286,7 @@
                 <w:sz w:val="18"/>
                 <w:color w:val="000000"/>
               </w:rPr>
-              <w:t>Figure 7b. Actual PulseView cursors from final configuration STOP (2.349362 s) to first 0x3B-read START (2.379390 s): 30.028 ms = 30028 us. Original instrument screenshot retained in w05/gap-cursors.png.</w:t>
+              <w:t>Figure 7b. Three cropped PulseView screenshots of the same capture: overview and endpoint zooms. A = final 0x38=0x01 configuration STOP (2.349362 s); B = first 0x3B-read START (2.379390 s). B-A = 30.028 ms = 30028 us. D0=SDA, D1=SCL; time scales differ. Full screenshots are in w05/figures/.</w:t>
             </w:r>
           </w:p>
         </w:tc>

</xml_diff>